<commit_message>
Agregar referencias APA 7 y actualizar levantamiento de observaciones
Nuevo documento con las 17 referencias en formato APA 7 citadas en el
levantamiento. Se corrige la cita del Manual de Dispositivos de Control
(versión 2024) y del Highway Capacity Manual (7.ª ed.) para que
coincidan con la bibliografía de la tesis.

Co-Authored-By: Claude Fable 5.1 <noreply@anthropic.com>
Claude-Session: https://claude.ai/code/session_01RaB3T2rshzNGTJkx2ERdJN
</commit_message>
<xml_diff>
--- a/docs/Levantamiento_Observaciones_Tesis_Malpartida_Bayona.docx
+++ b/docs/Levantamiento_Observaciones_Tesis_Malpartida_Bayona.docx
@@ -1047,7 +1047,7 @@
         <w:t xml:space="preserve">2.5 Hipótesis.</w:t>
       </w:r>
       <w:r>
-        <w:t xml:space="preserve"> La presente investigación es de tipo aplicada y de diseño proyectivo, con nivel descriptivo-propositivo y diseño no experimental (secciones 3.2 a 3.4). Su propósito es elaborar una propuesta de ingeniería y no contrastar relaciones causales o asociativas entre variables; por ello, de acuerdo con Hernández-Sampieri y Mendoza (2018) y Hurtado de Barrera (2010), no se formulan hipótesis de investigación. En su lugar, la validez de la propuesta se verifica mediante parámetros e indicadores técnicos de diseño, cuyos umbrales están fijados por la normativa del MTC (DG-2018; Manual de Suelos, Geología, Geotecnia y Pavimentos, 2014; Manual de Hidrología, Hidráulica y Drenaje, 2011; Manual de Dispositivos de Control del Tránsito, 2016) y por la metodología AASHTO 93. La Tabla 2 (operacionalización) establece, para cada indicador, el umbral normativo, el instrumento de verificación y la evidencia que permite aceptar o rechazar el cumplimiento.</w:t>
+        <w:t xml:space="preserve"> La presente investigación es de tipo aplicada y de diseño proyectivo, con nivel descriptivo-propositivo y diseño no experimental (secciones 3.2 a 3.4). Su propósito es elaborar una propuesta de ingeniería y no contrastar relaciones causales o asociativas entre variables; por ello, de acuerdo con Hernández-Sampieri y Mendoza (2018) y Hurtado de Barrera (2010), no se formulan hipótesis de investigación. En su lugar, la validez de la propuesta se verifica mediante parámetros e indicadores técnicos de diseño, cuyos umbrales están fijados por la normativa del MTC (DG-2018; Manual de Suelos, Geología, Geotecnia y Pavimentos, 2014; Manual de Hidrología, Hidráulica y Drenaje, 2011; Manual de Dispositivos de Control del Tránsito, 2024) y por la metodología AASHTO 93. La Tabla 2 (operacionalización) establece, para cada indicador, el umbral normativo, el instrumento de verificación y la evidencia que permite aceptar o rechazar el cumplimiento.</w:t>
       </w:r>
     </w:p>
     <w:p>
@@ -1368,7 +1368,7 @@
           <w:p>
             <w:pPr/>
             <w:r>
-              <w:t xml:space="preserve">HE7: El sistema de señalización vertical y horizontal cumple el Manual de Dispositivos de Control del Tránsito (2016) en tipo, ubicación y dimensiones</w:t>
+              <w:t xml:space="preserve">HE7: El sistema de señalización vertical y horizontal cumple el Manual de Dispositivos de Control del Tránsito (2024) en tipo, ubicación y dimensiones</w:t>
             </w:r>
           </w:p>
         </w:tc>
@@ -1887,7 +1887,7 @@
           <w:p>
             <w:pPr/>
             <w:r>
-              <w:t xml:space="preserve">MTC (2016). </w:t>
+              <w:t xml:space="preserve">MTC (2024). </w:t>
             </w:r>
             <w:r>
               <w:rPr>
@@ -1896,7 +1896,7 @@
               <w:t xml:space="preserve">Manual de Dispositivos de Control del Tránsito Automotor para Calles y Carreteras</w:t>
             </w:r>
             <w:r>
-              <w:t xml:space="preserve">. R.D. N.° 16-2016-MTC/14</w:t>
+              <w:t xml:space="preserve">. R.D. N.° 26-2024-MTC/18</w:t>
             </w:r>
           </w:p>
         </w:tc>
@@ -2057,7 +2057,7 @@
           <w:p>
             <w:pPr/>
             <w:r>
-              <w:t xml:space="preserve">TRB (2016). </w:t>
+              <w:t xml:space="preserve">TRB (2022). </w:t>
             </w:r>
             <w:r>
               <w:rPr>
@@ -2066,7 +2066,7 @@
               <w:t xml:space="preserve">Highway Capacity Manual</w:t>
             </w:r>
             <w:r>
-              <w:t xml:space="preserve">, 6.ª ed.</w:t>
+              <w:t xml:space="preserve">, 7.ª ed.</w:t>
             </w:r>
           </w:p>
         </w:tc>
@@ -3130,7 +3130,7 @@
           <w:p>
             <w:pPr/>
             <w:r>
-              <w:t xml:space="preserve">Manual de Dispositivos de Control del Tránsito 2016</w:t>
+              <w:t xml:space="preserve">Manual de Dispositivos de Control del Tránsito 2024</w:t>
             </w:r>
           </w:p>
         </w:tc>
@@ -4463,7 +4463,7 @@
         </w:numPr>
       </w:pPr>
       <w:r>
-        <w:t xml:space="preserve">Agregar a la Tabla 2 las dimensiones que faltan y que sí son objetivos: drenaje (indicador: caudal de diseño y capacidad hidráulica; instrumento: memoria hidrológica), obras de arte (indicador: galíbo y luz; instrumento: planos), señalización (indicador: conformidad de dispositivos; instrumento: ficha de verificación del Manual de Dispositivos 2016).</w:t>
+        <w:t xml:space="preserve">Agregar a la Tabla 2 las dimensiones que faltan y que sí son objetivos: drenaje (indicador: caudal de diseño y capacidad hidráulica; instrumento: memoria hidrológica), obras de arte (indicador: galíbo y luz; instrumento: planos), señalización (indicador: conformidad de dispositivos; instrumento: ficha de verificación del Manual de Dispositivos 2024).</w:t>
       </w:r>
     </w:p>
     <w:p>

</xml_diff>